<commit_message>
feat: add 10-min admin inactivity detection with 60s auto-lock warning and state preservation
</commit_message>
<xml_diff>
--- a/Souradeep_GSMESS_proposal.docx
+++ b/Souradeep_GSMESS_proposal.docx
@@ -632,6 +632,7 @@
           <w:sz w:val="24"/>
           <w:szCs w:val="24"/>
         </w:rPr>
+        <w:lastRenderedPageBreak/>
         <w:t>3. Extra Food Options on Payment Basis</w:t>
       </w:r>
     </w:p>
@@ -746,7 +747,6 @@
           <w:sz w:val="24"/>
           <w:szCs w:val="24"/>
         </w:rPr>
-        <w:lastRenderedPageBreak/>
         <w:t>4. Financial Fairness: The Smart Mess Rebate System</w:t>
       </w:r>
     </w:p>
@@ -982,7 +982,7 @@
         <w:numRestart w:val="eachSect"/>
       </w:footnotePr>
       <w:pgSz w:w="12240" w:h="15840"/>
-      <w:pgMar w:top="720" w:right="720" w:bottom="720" w:left="720" w:header="720" w:footer="720" w:gutter="0"/>
+      <w:pgMar w:top="1440" w:right="1440" w:bottom="1440" w:left="1440" w:header="720" w:footer="720" w:gutter="0"/>
       <w:cols w:space="720"/>
       <w:docGrid w:linePitch="326"/>
     </w:sectPr>

</xml_diff>